<commit_message>
Uploaded the Final Report
</commit_message>
<xml_diff>
--- a/Project Report/Final Report updated.docx
+++ b/Project Report/Final Report updated.docx
@@ -2,6 +2,7 @@
 <file path=word/document.xml><?xml version="1.0" encoding="utf-8"?>
 <w:document xmlns:wpc="http://schemas.microsoft.com/office/word/2010/wordprocessingCanvas" xmlns:cx="http://schemas.microsoft.com/office/drawing/2014/chartex" xmlns:cx1="http://schemas.microsoft.com/office/drawing/2015/9/8/chartex" xmlns:cx2="http://schemas.microsoft.com/office/drawing/2015/10/21/chartex" xmlns:cx3="http://schemas.microsoft.com/office/drawing/2016/5/9/chartex" xmlns:cx4="http://schemas.microsoft.com/office/drawing/2016/5/10/chartex" xmlns:cx5="http://schemas.microsoft.com/office/drawing/2016/5/11/chartex" xmlns:cx6="http://schemas.microsoft.com/office/drawing/2016/5/12/chartex" xmlns:cx7="http://schemas.microsoft.com/office/drawing/2016/5/13/chartex" xmlns:cx8="http://schemas.microsoft.com/office/drawing/2016/5/14/chartex" xmlns:mc="http://schemas.openxmlformats.org/markup-compatibility/2006" xmlns:aink="http://schemas.microsoft.com/office/drawing/2016/ink" xmlns:am3d="http://schemas.microsoft.com/office/drawing/2017/model3d" xmlns:o="urn:schemas-microsoft-com:office:office" xmlns:oel="http://schemas.microsoft.com/office/2019/extlst" xmlns:r="http://schemas.openxmlformats.org/officeDocument/2006/relationships" xmlns:m="http://schemas.openxmlformats.org/officeDocument/2006/math" xmlns:v="urn:schemas-microsoft-com:vml" xmlns:wp14="http://schemas.microsoft.com/office/word/2010/wordprocessingDrawing" xmlns:wp="http://schemas.openxmlformats.org/drawingml/2006/wordprocessingDrawing" xmlns:w10="urn:schemas-microsoft-com:office:word" xmlns:w="http://schemas.openxmlformats.org/wordprocessingml/2006/main" xmlns:w14="http://schemas.microsoft.com/office/word/2010/wordml" xmlns:w15="http://schemas.microsoft.com/office/word/2012/wordml" xmlns:w16cex="http://schemas.microsoft.com/office/word/2018/wordml/cex" xmlns:w16cid="http://schemas.microsoft.com/office/word/2016/wordml/cid" xmlns:w16="http://schemas.microsoft.com/office/word/2018/wordml" xmlns:w16du="http://schemas.microsoft.com/office/word/2023/wordml/word16du" xmlns:w16sdtdh="http://schemas.microsoft.com/office/word/2020/wordml/sdtdatahash" xmlns:w16sdtfl="http://schemas.microsoft.com/office/word/2024/wordml/sdtformatlock" xmlns:w16se="http://schemas.microsoft.com/office/word/2015/wordml/symex" xmlns:wpg="http://schemas.microsoft.com/office/word/2010/wordprocessingGroup" xmlns:wpi="http://schemas.microsoft.com/office/word/2010/wordprocessingInk" xmlns:wne="http://schemas.microsoft.com/office/word/2006/wordml" xmlns:wps="http://schemas.microsoft.com/office/word/2010/wordprocessingShape" mc:Ignorable="w14 w15 w16se w16cid w16 w16cex w16sdtdh w16sdtfl w16du wp14">
   <w:body>
+    <w:bookmarkStart w:id="0" w:name="_Toc196989287"/>
     <w:p>
       <w:pPr>
         <w:pStyle w:val="Heading2"/>
@@ -11,12 +12,96 @@
           <w:szCs w:val="96"/>
         </w:rPr>
       </w:pPr>
-      <w:bookmarkStart w:id="0" w:name="_Toc196989287"/>
-      <w:r>
-        <w:rPr>
+      <w:r>
+        <w:rPr>
+          <w:noProof/>
           <w:sz w:val="96"/>
           <w:szCs w:val="96"/>
         </w:rPr>
+        <mc:AlternateContent>
+          <mc:Choice Requires="wps">
+            <w:drawing>
+              <wp:anchor distT="0" distB="0" distL="114300" distR="114300" simplePos="0" relativeHeight="251687936" behindDoc="0" locked="0" layoutInCell="1" allowOverlap="1" wp14:anchorId="786245CF" wp14:editId="08A6E61C">
+                <wp:simplePos x="0" y="0"/>
+                <wp:positionH relativeFrom="margin">
+                  <wp:align>center</wp:align>
+                </wp:positionH>
+                <wp:positionV relativeFrom="paragraph">
+                  <wp:posOffset>-630117</wp:posOffset>
+                </wp:positionV>
+                <wp:extent cx="7173311" cy="9475076"/>
+                <wp:effectExtent l="19050" t="19050" r="27940" b="12065"/>
+                <wp:wrapNone/>
+                <wp:docPr id="1720030420" name="Rectangle 16"/>
+                <wp:cNvGraphicFramePr/>
+                <a:graphic xmlns:a="http://schemas.openxmlformats.org/drawingml/2006/main">
+                  <a:graphicData uri="http://schemas.microsoft.com/office/word/2010/wordprocessingShape">
+                    <wps:wsp>
+                      <wps:cNvSpPr/>
+                      <wps:spPr>
+                        <a:xfrm>
+                          <a:off x="0" y="0"/>
+                          <a:ext cx="7173311" cy="9475076"/>
+                        </a:xfrm>
+                        <a:prstGeom prst="rect">
+                          <a:avLst/>
+                        </a:prstGeom>
+                        <a:noFill/>
+                        <a:ln w="38100" cmpd="tri">
+                          <a:solidFill>
+                            <a:srgbClr val="002060"/>
+                          </a:solidFill>
+                        </a:ln>
+                      </wps:spPr>
+                      <wps:style>
+                        <a:lnRef idx="2">
+                          <a:schemeClr val="accent1">
+                            <a:shade val="15000"/>
+                          </a:schemeClr>
+                        </a:lnRef>
+                        <a:fillRef idx="1">
+                          <a:schemeClr val="accent1"/>
+                        </a:fillRef>
+                        <a:effectRef idx="0">
+                          <a:schemeClr val="accent1"/>
+                        </a:effectRef>
+                        <a:fontRef idx="minor">
+                          <a:schemeClr val="lt1"/>
+                        </a:fontRef>
+                      </wps:style>
+                      <wps:bodyPr rot="0" spcFirstLastPara="0" vertOverflow="overflow" horzOverflow="overflow" vert="horz" wrap="square" lIns="91440" tIns="45720" rIns="91440" bIns="45720" numCol="1" spcCol="0" rtlCol="0" fromWordArt="0" anchor="ctr" anchorCtr="0" forceAA="0" compatLnSpc="1">
+                        <a:prstTxWarp prst="textNoShape">
+                          <a:avLst/>
+                        </a:prstTxWarp>
+                        <a:noAutofit/>
+                      </wps:bodyPr>
+                    </wps:wsp>
+                  </a:graphicData>
+                </a:graphic>
+                <wp14:sizeRelH relativeFrom="margin">
+                  <wp14:pctWidth>0</wp14:pctWidth>
+                </wp14:sizeRelH>
+                <wp14:sizeRelV relativeFrom="margin">
+                  <wp14:pctHeight>0</wp14:pctHeight>
+                </wp14:sizeRelV>
+              </wp:anchor>
+            </w:drawing>
+          </mc:Choice>
+          <mc:Fallback>
+            <w:pict>
+              <v:rect w14:anchorId="11D733E5" id="Rectangle 16" o:spid="_x0000_s1026" style="position:absolute;margin-left:0;margin-top:-49.6pt;width:564.85pt;height:746.05pt;z-index:251687936;visibility:visible;mso-wrap-style:square;mso-width-percent:0;mso-height-percent:0;mso-wrap-distance-left:9pt;mso-wrap-distance-top:0;mso-wrap-distance-right:9pt;mso-wrap-distance-bottom:0;mso-position-horizontal:center;mso-position-horizontal-relative:margin;mso-position-vertical:absolute;mso-position-vertical-relative:text;mso-width-percent:0;mso-height-percent:0;mso-width-relative:margin;mso-height-relative:margin;v-text-anchor:middle" o:gfxdata="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" filled="f" strokecolor="#002060" strokeweight="3pt">
+                <v:stroke linestyle="thickBetweenThin"/>
+                <w10:wrap anchorx="margin"/>
+              </v:rect>
+            </w:pict>
+          </mc:Fallback>
+        </mc:AlternateContent>
+      </w:r>
+      <w:r>
+        <w:rPr>
+          <w:sz w:val="96"/>
+          <w:szCs w:val="96"/>
+        </w:rPr>
         <w:t>ONLINE FASHION STORE MANAGEMENT SYSTEM</w:t>
       </w:r>
       <w:bookmarkEnd w:id="0"/>
@@ -94,7 +179,14 @@
           <w:sz w:val="32"/>
           <w:szCs w:val="32"/>
         </w:rPr>
-        <w:t>GROUP MEMBERS-</w:t>
+        <w:t>GROUP MEMBERS</w:t>
+      </w:r>
+      <w:r>
+        <w:rPr>
+          <w:sz w:val="32"/>
+          <w:szCs w:val="32"/>
+        </w:rPr>
+        <w:t>:</w:t>
       </w:r>
     </w:p>
     <w:p>
@@ -184,16 +276,8 @@
         <w:rPr>
           <w:sz w:val="28"/>
         </w:rPr>
-        <w:t xml:space="preserve">L. A. </w:t>
-      </w:r>
-      <w:proofErr w:type="spellStart"/>
-      <w:r>
-        <w:rPr>
-          <w:sz w:val="28"/>
-        </w:rPr>
-        <w:t>Thathsarani</w:t>
-      </w:r>
-      <w:proofErr w:type="spellEnd"/>
+        <w:t>L. A. Thathsarani</w:t>
+      </w:r>
     </w:p>
     <w:p>
       <w:pPr>
@@ -262,14 +346,12 @@
         </w:rPr>
         <w:t xml:space="preserve"> </w:t>
       </w:r>
-      <w:proofErr w:type="spellStart"/>
       <w:r>
         <w:rPr>
           <w:sz w:val="28"/>
         </w:rPr>
         <w:t>Sooriyasena</w:t>
       </w:r>
-      <w:proofErr w:type="spellEnd"/>
     </w:p>
     <w:p>
       <w:pPr>
@@ -2759,7 +2841,23 @@
           <w:sz w:val="32"/>
           <w:szCs w:val="32"/>
         </w:rPr>
-        <w:t>Customer needs to log the system in order to place the order.</w:t>
+        <w:t>Customer needs to log</w:t>
+      </w:r>
+      <w:r>
+        <w:rPr>
+          <w:rFonts w:asciiTheme="minorHAnsi" w:hAnsiTheme="minorHAnsi" w:cstheme="minorHAnsi"/>
+          <w:sz w:val="32"/>
+          <w:szCs w:val="32"/>
+        </w:rPr>
+        <w:t xml:space="preserve"> into</w:t>
+      </w:r>
+      <w:r>
+        <w:rPr>
+          <w:rFonts w:asciiTheme="minorHAnsi" w:hAnsiTheme="minorHAnsi" w:cstheme="minorHAnsi"/>
+          <w:sz w:val="32"/>
+          <w:szCs w:val="32"/>
+        </w:rPr>
+        <w:t xml:space="preserve"> the system in order to place the order.</w:t>
       </w:r>
     </w:p>
     <w:p>
@@ -2781,40 +2879,32 @@
           <w:sz w:val="32"/>
           <w:szCs w:val="32"/>
         </w:rPr>
-        <w:t xml:space="preserve">DELIVERY is necessary to place </w:t>
-      </w:r>
-      <w:proofErr w:type="spellStart"/>
-      <w:proofErr w:type="gramStart"/>
+        <w:t>DELIVERY is necessary to place a</w:t>
+      </w:r>
       <w:r>
         <w:rPr>
           <w:rFonts w:asciiTheme="minorHAnsi" w:hAnsiTheme="minorHAnsi" w:cstheme="minorHAnsi"/>
           <w:sz w:val="32"/>
           <w:szCs w:val="32"/>
         </w:rPr>
-        <w:t>a</w:t>
-      </w:r>
-      <w:proofErr w:type="spellEnd"/>
-      <w:proofErr w:type="gramEnd"/>
+        <w:t>n</w:t>
+      </w:r>
       <w:r>
         <w:rPr>
           <w:rFonts w:asciiTheme="minorHAnsi" w:hAnsiTheme="minorHAnsi" w:cstheme="minorHAnsi"/>
           <w:sz w:val="32"/>
           <w:szCs w:val="32"/>
         </w:rPr>
-        <w:t xml:space="preserve"> ORDER and </w:t>
-      </w:r>
-      <w:proofErr w:type="spellStart"/>
-      <w:proofErr w:type="gramStart"/>
+        <w:t xml:space="preserve"> ORDER and a</w:t>
+      </w:r>
       <w:r>
         <w:rPr>
           <w:rFonts w:asciiTheme="minorHAnsi" w:hAnsiTheme="minorHAnsi" w:cstheme="minorHAnsi"/>
           <w:sz w:val="32"/>
           <w:szCs w:val="32"/>
         </w:rPr>
-        <w:t>a</w:t>
-      </w:r>
-      <w:proofErr w:type="spellEnd"/>
-      <w:proofErr w:type="gramEnd"/>
+        <w:t>n</w:t>
+      </w:r>
       <w:r>
         <w:rPr>
           <w:rFonts w:asciiTheme="minorHAnsi" w:hAnsiTheme="minorHAnsi" w:cstheme="minorHAnsi"/>
@@ -3082,19 +3172,25 @@
           <w:sz w:val="28"/>
           <w:szCs w:val="28"/>
         </w:rPr>
-        <w:t>One CUSTOMER can have one WISHLISTs and a WISHLIST can have only one  CUSTOMER.</w:t>
-      </w:r>
-    </w:p>
-    <w:p>
-      <w:pPr>
-        <w:pStyle w:val="ListParagraph"/>
-        <w:ind w:left="990"/>
+        <w:t>One CUSTOMER can have one WISHLIST and a WISHLIST can have only one  CUSTOMER.</w:t>
+      </w:r>
+    </w:p>
+    <w:p>
+      <w:pPr>
         <w:rPr>
           <w:rFonts w:cstheme="minorHAnsi"/>
           <w:sz w:val="28"/>
           <w:szCs w:val="28"/>
         </w:rPr>
       </w:pPr>
+      <w:r>
+        <w:rPr>
+          <w:rFonts w:cstheme="minorHAnsi"/>
+          <w:sz w:val="28"/>
+          <w:szCs w:val="28"/>
+        </w:rPr>
+        <w:br w:type="page"/>
+      </w:r>
     </w:p>
     <w:p>
       <w:pPr>
@@ -3114,6 +3210,7 @@
           <w:sz w:val="36"/>
           <w:szCs w:val="36"/>
         </w:rPr>
+        <w:lastRenderedPageBreak/>
         <w:t>CUSTOMER-MESSAGE Relation</w:t>
       </w:r>
     </w:p>
@@ -3330,20 +3427,16 @@
           <w:sz w:val="28"/>
           <w:szCs w:val="28"/>
         </w:rPr>
-        <w:t xml:space="preserve"> ORDER and </w:t>
-      </w:r>
-      <w:proofErr w:type="spellStart"/>
-      <w:proofErr w:type="gramStart"/>
+        <w:t xml:space="preserve"> ORDER and a</w:t>
+      </w:r>
       <w:r>
         <w:rPr>
           <w:rFonts w:cstheme="minorHAnsi"/>
           <w:sz w:val="28"/>
           <w:szCs w:val="28"/>
         </w:rPr>
-        <w:t>a</w:t>
-      </w:r>
-      <w:proofErr w:type="spellEnd"/>
-      <w:proofErr w:type="gramEnd"/>
+        <w:t>n</w:t>
+      </w:r>
       <w:r>
         <w:rPr>
           <w:rFonts w:cstheme="minorHAnsi"/>
@@ -3415,6 +3508,14 @@
           <w:szCs w:val="28"/>
         </w:rPr>
       </w:pPr>
+      <w:r>
+        <w:rPr>
+          <w:rFonts w:asciiTheme="minorHAnsi" w:hAnsiTheme="minorHAnsi" w:cstheme="minorHAnsi"/>
+          <w:sz w:val="28"/>
+          <w:szCs w:val="28"/>
+        </w:rPr>
+        <w:t xml:space="preserve">An </w:t>
+      </w:r>
       <w:r>
         <w:rPr>
           <w:rFonts w:asciiTheme="minorHAnsi" w:hAnsiTheme="minorHAnsi" w:cstheme="minorHAnsi"/>
@@ -4078,7 +4179,6 @@
         </w:rPr>
         <w:t>(</w:t>
       </w:r>
-      <w:proofErr w:type="spellStart"/>
       <w:r>
         <w:rPr>
           <w:sz w:val="22"/>
@@ -4086,7 +4186,6 @@
         </w:rPr>
         <w:t>online_fashion_store_management_system</w:t>
       </w:r>
-      <w:proofErr w:type="spellEnd"/>
       <w:r>
         <w:rPr>
           <w:sz w:val="22"/>
@@ -4112,23 +4211,13 @@
         </w:rPr>
         <w:t xml:space="preserve">CREATE   DATABASE  </w:t>
       </w:r>
-      <w:proofErr w:type="spellStart"/>
       <w:r>
         <w:rPr>
           <w:color w:val="92D050"/>
           <w:sz w:val="22"/>
           <w:szCs w:val="22"/>
         </w:rPr>
-        <w:t>online_fashion_store_management_system</w:t>
-      </w:r>
-      <w:proofErr w:type="spellEnd"/>
-      <w:r>
-        <w:rPr>
-          <w:color w:val="92D050"/>
-          <w:sz w:val="22"/>
-          <w:szCs w:val="22"/>
-        </w:rPr>
-        <w:t>;</w:t>
+        <w:t>online_fashion_store_management_system;</w:t>
       </w:r>
     </w:p>
     <w:p>
@@ -4297,23 +4386,13 @@
         </w:rPr>
         <w:t xml:space="preserve">USE </w:t>
       </w:r>
-      <w:proofErr w:type="spellStart"/>
       <w:r>
         <w:rPr>
           <w:color w:val="92D050"/>
           <w:sz w:val="22"/>
           <w:szCs w:val="22"/>
         </w:rPr>
-        <w:t>online_fashion_store_management_system</w:t>
-      </w:r>
-      <w:proofErr w:type="spellEnd"/>
-      <w:r>
-        <w:rPr>
-          <w:color w:val="92D050"/>
-          <w:sz w:val="22"/>
-          <w:szCs w:val="22"/>
-        </w:rPr>
-        <w:t>;</w:t>
+        <w:t>online_fashion_store_management_system;</w:t>
       </w:r>
     </w:p>
     <w:p>
@@ -5926,21 +6005,12 @@
           <w:szCs w:val="22"/>
         </w:rPr>
       </w:pPr>
-      <w:proofErr w:type="spellStart"/>
-      <w:r>
-        <w:rPr>
-          <w:sz w:val="22"/>
-          <w:szCs w:val="22"/>
-        </w:rPr>
-        <w:t>Product_detail</w:t>
-      </w:r>
-      <w:proofErr w:type="spellEnd"/>
-      <w:r>
-        <w:rPr>
-          <w:sz w:val="22"/>
-          <w:szCs w:val="22"/>
-        </w:rPr>
-        <w:t xml:space="preserve"> </w:t>
+      <w:r>
+        <w:rPr>
+          <w:sz w:val="22"/>
+          <w:szCs w:val="22"/>
+        </w:rPr>
+        <w:t xml:space="preserve">Product_detail </w:t>
       </w:r>
       <w:r>
         <w:rPr>
@@ -6029,21 +6099,12 @@
           <w:szCs w:val="22"/>
         </w:rPr>
       </w:pPr>
-      <w:proofErr w:type="spellStart"/>
-      <w:r>
-        <w:rPr>
-          <w:sz w:val="22"/>
-          <w:szCs w:val="22"/>
-        </w:rPr>
-        <w:t>Admin_id</w:t>
-      </w:r>
-      <w:proofErr w:type="spellEnd"/>
-      <w:r>
-        <w:rPr>
-          <w:sz w:val="22"/>
-          <w:szCs w:val="22"/>
-        </w:rPr>
-        <w:t xml:space="preserve"> </w:t>
+      <w:r>
+        <w:rPr>
+          <w:sz w:val="22"/>
+          <w:szCs w:val="22"/>
+        </w:rPr>
+        <w:t xml:space="preserve">Admin_id </w:t>
       </w:r>
       <w:r>
         <w:rPr>
@@ -6123,23 +6184,7 @@
           <w:sz w:val="22"/>
           <w:szCs w:val="22"/>
         </w:rPr>
-        <w:t>(</w:t>
-      </w:r>
-      <w:proofErr w:type="spellStart"/>
-      <w:r>
-        <w:rPr>
-          <w:sz w:val="22"/>
-          <w:szCs w:val="22"/>
-        </w:rPr>
-        <w:t>Admin_id</w:t>
-      </w:r>
-      <w:proofErr w:type="spellEnd"/>
-      <w:r>
-        <w:rPr>
-          <w:sz w:val="22"/>
-          <w:szCs w:val="22"/>
-        </w:rPr>
-        <w:t xml:space="preserve">) </w:t>
+        <w:t xml:space="preserve">(Admin_id) </w:t>
       </w:r>
       <w:r>
         <w:rPr>
@@ -6487,21 +6532,12 @@
           <w:szCs w:val="22"/>
         </w:rPr>
       </w:pPr>
-      <w:proofErr w:type="spellStart"/>
-      <w:r>
-        <w:rPr>
-          <w:sz w:val="22"/>
-          <w:szCs w:val="22"/>
-        </w:rPr>
-        <w:t>Customer_id</w:t>
-      </w:r>
-      <w:proofErr w:type="spellEnd"/>
-      <w:r>
-        <w:rPr>
-          <w:sz w:val="22"/>
-          <w:szCs w:val="22"/>
-        </w:rPr>
-        <w:t xml:space="preserve"> </w:t>
+      <w:r>
+        <w:rPr>
+          <w:sz w:val="22"/>
+          <w:szCs w:val="22"/>
+        </w:rPr>
+        <w:t xml:space="preserve">Customer_id </w:t>
       </w:r>
       <w:r>
         <w:rPr>
@@ -6582,23 +6618,7 @@
           <w:sz w:val="22"/>
           <w:szCs w:val="22"/>
         </w:rPr>
-        <w:t>(</w:t>
-      </w:r>
-      <w:proofErr w:type="spellStart"/>
-      <w:r>
-        <w:rPr>
-          <w:sz w:val="22"/>
-          <w:szCs w:val="22"/>
-        </w:rPr>
-        <w:t>Customer_id</w:t>
-      </w:r>
-      <w:proofErr w:type="spellEnd"/>
-      <w:r>
-        <w:rPr>
-          <w:sz w:val="22"/>
-          <w:szCs w:val="22"/>
-        </w:rPr>
-        <w:t xml:space="preserve">) </w:t>
+        <w:t xml:space="preserve">(Customer_id) </w:t>
       </w:r>
       <w:r>
         <w:rPr>
@@ -6869,21 +6889,12 @@
           <w:szCs w:val="22"/>
         </w:rPr>
       </w:pPr>
-      <w:proofErr w:type="spellStart"/>
-      <w:r>
-        <w:rPr>
-          <w:sz w:val="22"/>
-          <w:szCs w:val="22"/>
-        </w:rPr>
-        <w:t>Cart_id</w:t>
-      </w:r>
-      <w:proofErr w:type="spellEnd"/>
-      <w:r>
-        <w:rPr>
-          <w:sz w:val="22"/>
-          <w:szCs w:val="22"/>
-        </w:rPr>
-        <w:t xml:space="preserve"> </w:t>
+      <w:r>
+        <w:rPr>
+          <w:sz w:val="22"/>
+          <w:szCs w:val="22"/>
+        </w:rPr>
+        <w:t xml:space="preserve">Cart_id </w:t>
       </w:r>
       <w:r>
         <w:rPr>
@@ -6925,21 +6936,12 @@
           <w:szCs w:val="22"/>
         </w:rPr>
       </w:pPr>
-      <w:proofErr w:type="spellStart"/>
-      <w:r>
-        <w:rPr>
-          <w:sz w:val="22"/>
-          <w:szCs w:val="22"/>
-        </w:rPr>
-        <w:t>Product_id</w:t>
-      </w:r>
-      <w:proofErr w:type="spellEnd"/>
-      <w:r>
-        <w:rPr>
-          <w:sz w:val="22"/>
-          <w:szCs w:val="22"/>
-        </w:rPr>
-        <w:t xml:space="preserve"> </w:t>
+      <w:r>
+        <w:rPr>
+          <w:sz w:val="22"/>
+          <w:szCs w:val="22"/>
+        </w:rPr>
+        <w:t xml:space="preserve">Product_id </w:t>
       </w:r>
       <w:r>
         <w:rPr>
@@ -7057,39 +7059,7 @@
           <w:sz w:val="22"/>
           <w:szCs w:val="22"/>
         </w:rPr>
-        <w:t>(</w:t>
-      </w:r>
-      <w:proofErr w:type="spellStart"/>
-      <w:r>
-        <w:rPr>
-          <w:sz w:val="22"/>
-          <w:szCs w:val="22"/>
-        </w:rPr>
-        <w:t>Cart_id</w:t>
-      </w:r>
-      <w:proofErr w:type="spellEnd"/>
-      <w:r>
-        <w:rPr>
-          <w:sz w:val="22"/>
-          <w:szCs w:val="22"/>
-        </w:rPr>
-        <w:t xml:space="preserve">, </w:t>
-      </w:r>
-      <w:proofErr w:type="spellStart"/>
-      <w:r>
-        <w:rPr>
-          <w:sz w:val="22"/>
-          <w:szCs w:val="22"/>
-        </w:rPr>
-        <w:t>Product_id</w:t>
-      </w:r>
-      <w:proofErr w:type="spellEnd"/>
-      <w:r>
-        <w:rPr>
-          <w:sz w:val="22"/>
-          <w:szCs w:val="22"/>
-        </w:rPr>
-        <w:t xml:space="preserve">), </w:t>
+        <w:t xml:space="preserve">(Cart_id, Product_id), </w:t>
       </w:r>
     </w:p>
     <w:p>
@@ -7114,23 +7084,7 @@
           <w:sz w:val="22"/>
           <w:szCs w:val="22"/>
         </w:rPr>
-        <w:t>(</w:t>
-      </w:r>
-      <w:proofErr w:type="spellStart"/>
-      <w:r>
-        <w:rPr>
-          <w:sz w:val="22"/>
-          <w:szCs w:val="22"/>
-        </w:rPr>
-        <w:t>Cart_id</w:t>
-      </w:r>
-      <w:proofErr w:type="spellEnd"/>
-      <w:r>
-        <w:rPr>
-          <w:sz w:val="22"/>
-          <w:szCs w:val="22"/>
-        </w:rPr>
-        <w:t xml:space="preserve">) </w:t>
+        <w:t xml:space="preserve">(Cart_id) </w:t>
       </w:r>
       <w:r>
         <w:rPr>
@@ -7201,23 +7155,7 @@
           <w:sz w:val="22"/>
           <w:szCs w:val="22"/>
         </w:rPr>
-        <w:t>(</w:t>
-      </w:r>
-      <w:proofErr w:type="spellStart"/>
-      <w:r>
-        <w:rPr>
-          <w:sz w:val="22"/>
-          <w:szCs w:val="22"/>
-        </w:rPr>
-        <w:t>Product_id</w:t>
-      </w:r>
-      <w:proofErr w:type="spellEnd"/>
-      <w:r>
-        <w:rPr>
-          <w:sz w:val="22"/>
-          <w:szCs w:val="22"/>
-        </w:rPr>
-        <w:t xml:space="preserve">) </w:t>
+        <w:t xml:space="preserve">(Product_id) </w:t>
       </w:r>
       <w:r>
         <w:rPr>
@@ -7542,21 +7480,12 @@
           <w:szCs w:val="22"/>
         </w:rPr>
       </w:pPr>
-      <w:proofErr w:type="spellStart"/>
-      <w:r>
-        <w:rPr>
-          <w:sz w:val="22"/>
-          <w:szCs w:val="22"/>
-        </w:rPr>
-        <w:t>Customer_Id</w:t>
-      </w:r>
-      <w:proofErr w:type="spellEnd"/>
-      <w:r>
-        <w:rPr>
-          <w:sz w:val="22"/>
-          <w:szCs w:val="22"/>
-        </w:rPr>
-        <w:t xml:space="preserve"> </w:t>
+      <w:r>
+        <w:rPr>
+          <w:sz w:val="22"/>
+          <w:szCs w:val="22"/>
+        </w:rPr>
+        <w:t xml:space="preserve">Customer_Id </w:t>
       </w:r>
       <w:r>
         <w:rPr>
@@ -7637,23 +7566,7 @@
           <w:sz w:val="22"/>
           <w:szCs w:val="22"/>
         </w:rPr>
-        <w:t>(</w:t>
-      </w:r>
-      <w:proofErr w:type="spellStart"/>
-      <w:r>
-        <w:rPr>
-          <w:sz w:val="22"/>
-          <w:szCs w:val="22"/>
-        </w:rPr>
-        <w:t>Customer_Id</w:t>
-      </w:r>
-      <w:proofErr w:type="spellEnd"/>
-      <w:r>
-        <w:rPr>
-          <w:sz w:val="22"/>
-          <w:szCs w:val="22"/>
-        </w:rPr>
-        <w:t xml:space="preserve">) </w:t>
+        <w:t xml:space="preserve">(Customer_Id) </w:t>
       </w:r>
       <w:r>
         <w:rPr>
@@ -7959,21 +7872,12 @@
           <w:szCs w:val="22"/>
         </w:rPr>
       </w:pPr>
-      <w:proofErr w:type="spellStart"/>
-      <w:r>
-        <w:rPr>
-          <w:sz w:val="22"/>
-          <w:szCs w:val="22"/>
-        </w:rPr>
-        <w:t>Wishlist_id</w:t>
-      </w:r>
-      <w:proofErr w:type="spellEnd"/>
-      <w:r>
-        <w:rPr>
-          <w:sz w:val="22"/>
-          <w:szCs w:val="22"/>
-        </w:rPr>
-        <w:t xml:space="preserve"> </w:t>
+      <w:r>
+        <w:rPr>
+          <w:sz w:val="22"/>
+          <w:szCs w:val="22"/>
+        </w:rPr>
+        <w:t xml:space="preserve">Wishlist_id </w:t>
       </w:r>
       <w:r>
         <w:rPr>
@@ -8015,21 +7919,12 @@
           <w:szCs w:val="22"/>
         </w:rPr>
       </w:pPr>
-      <w:proofErr w:type="spellStart"/>
-      <w:r>
-        <w:rPr>
-          <w:sz w:val="22"/>
-          <w:szCs w:val="22"/>
-        </w:rPr>
-        <w:t>Product_id</w:t>
-      </w:r>
-      <w:proofErr w:type="spellEnd"/>
-      <w:r>
-        <w:rPr>
-          <w:sz w:val="22"/>
-          <w:szCs w:val="22"/>
-        </w:rPr>
-        <w:t xml:space="preserve"> </w:t>
+      <w:r>
+        <w:rPr>
+          <w:sz w:val="22"/>
+          <w:szCs w:val="22"/>
+        </w:rPr>
+        <w:t xml:space="preserve">Product_id </w:t>
       </w:r>
       <w:r>
         <w:rPr>
@@ -8084,39 +7979,7 @@
           <w:sz w:val="22"/>
           <w:szCs w:val="22"/>
         </w:rPr>
-        <w:t>(</w:t>
-      </w:r>
-      <w:proofErr w:type="spellStart"/>
-      <w:r>
-        <w:rPr>
-          <w:sz w:val="22"/>
-          <w:szCs w:val="22"/>
-        </w:rPr>
-        <w:t>Wishlist_id</w:t>
-      </w:r>
-      <w:proofErr w:type="spellEnd"/>
-      <w:r>
-        <w:rPr>
-          <w:sz w:val="22"/>
-          <w:szCs w:val="22"/>
-        </w:rPr>
-        <w:t xml:space="preserve">, </w:t>
-      </w:r>
-      <w:proofErr w:type="spellStart"/>
-      <w:r>
-        <w:rPr>
-          <w:sz w:val="22"/>
-          <w:szCs w:val="22"/>
-        </w:rPr>
-        <w:t>Product_id</w:t>
-      </w:r>
-      <w:proofErr w:type="spellEnd"/>
-      <w:r>
-        <w:rPr>
-          <w:sz w:val="22"/>
-          <w:szCs w:val="22"/>
-        </w:rPr>
-        <w:t xml:space="preserve">), </w:t>
+        <w:t xml:space="preserve">(Wishlist_id, Product_id), </w:t>
       </w:r>
     </w:p>
     <w:p>
@@ -8141,23 +8004,7 @@
           <w:sz w:val="22"/>
           <w:szCs w:val="22"/>
         </w:rPr>
-        <w:t>(</w:t>
-      </w:r>
-      <w:proofErr w:type="spellStart"/>
-      <w:r>
-        <w:rPr>
-          <w:sz w:val="22"/>
-          <w:szCs w:val="22"/>
-        </w:rPr>
-        <w:t>Wishlist_id</w:t>
-      </w:r>
-      <w:proofErr w:type="spellEnd"/>
-      <w:r>
-        <w:rPr>
-          <w:sz w:val="22"/>
-          <w:szCs w:val="22"/>
-        </w:rPr>
-        <w:t xml:space="preserve"> ) </w:t>
+        <w:t xml:space="preserve">(Wishlist_id ) </w:t>
       </w:r>
       <w:r>
         <w:rPr>
@@ -8220,23 +8067,7 @@
           <w:sz w:val="22"/>
           <w:szCs w:val="22"/>
         </w:rPr>
-        <w:t xml:space="preserve"> (</w:t>
-      </w:r>
-      <w:proofErr w:type="spellStart"/>
-      <w:r>
-        <w:rPr>
-          <w:sz w:val="22"/>
-          <w:szCs w:val="22"/>
-        </w:rPr>
-        <w:t>Product_id</w:t>
-      </w:r>
-      <w:proofErr w:type="spellEnd"/>
-      <w:r>
-        <w:rPr>
-          <w:sz w:val="22"/>
-          <w:szCs w:val="22"/>
-        </w:rPr>
-        <w:t xml:space="preserve">) </w:t>
+        <w:t xml:space="preserve"> (Product_id) </w:t>
       </w:r>
       <w:r>
         <w:rPr>
@@ -8666,21 +8497,12 @@
           <w:szCs w:val="22"/>
         </w:rPr>
       </w:pPr>
-      <w:proofErr w:type="spellStart"/>
-      <w:r>
-        <w:rPr>
-          <w:sz w:val="22"/>
-          <w:szCs w:val="22"/>
-        </w:rPr>
-        <w:t>Customer_id</w:t>
-      </w:r>
-      <w:proofErr w:type="spellEnd"/>
-      <w:r>
-        <w:rPr>
-          <w:sz w:val="22"/>
-          <w:szCs w:val="22"/>
-        </w:rPr>
-        <w:t xml:space="preserve"> </w:t>
+      <w:r>
+        <w:rPr>
+          <w:sz w:val="22"/>
+          <w:szCs w:val="22"/>
+        </w:rPr>
+        <w:t xml:space="preserve">Customer_id </w:t>
       </w:r>
       <w:r>
         <w:rPr>
@@ -8722,21 +8544,12 @@
           <w:szCs w:val="22"/>
         </w:rPr>
       </w:pPr>
-      <w:proofErr w:type="spellStart"/>
-      <w:r>
-        <w:rPr>
-          <w:sz w:val="22"/>
-          <w:szCs w:val="22"/>
-        </w:rPr>
-        <w:t>Message_type</w:t>
-      </w:r>
-      <w:proofErr w:type="spellEnd"/>
-      <w:r>
-        <w:rPr>
-          <w:sz w:val="22"/>
-          <w:szCs w:val="22"/>
-        </w:rPr>
-        <w:t xml:space="preserve"> </w:t>
+      <w:r>
+        <w:rPr>
+          <w:sz w:val="22"/>
+          <w:szCs w:val="22"/>
+        </w:rPr>
+        <w:t xml:space="preserve">Message_type </w:t>
       </w:r>
       <w:r>
         <w:rPr>
@@ -8864,23 +8677,7 @@
           <w:sz w:val="22"/>
           <w:szCs w:val="22"/>
         </w:rPr>
-        <w:t>(</w:t>
-      </w:r>
-      <w:proofErr w:type="spellStart"/>
-      <w:r>
-        <w:rPr>
-          <w:sz w:val="22"/>
-          <w:szCs w:val="22"/>
-        </w:rPr>
-        <w:t>Customer_id</w:t>
-      </w:r>
-      <w:proofErr w:type="spellEnd"/>
-      <w:r>
-        <w:rPr>
-          <w:sz w:val="22"/>
-          <w:szCs w:val="22"/>
-        </w:rPr>
-        <w:t xml:space="preserve">) </w:t>
+        <w:t xml:space="preserve">(Customer_id) </w:t>
       </w:r>
       <w:r>
         <w:rPr>
@@ -9278,21 +9075,12 @@
           <w:szCs w:val="22"/>
         </w:rPr>
       </w:pPr>
-      <w:proofErr w:type="spellStart"/>
-      <w:r>
-        <w:rPr>
-          <w:sz w:val="22"/>
-          <w:szCs w:val="22"/>
-        </w:rPr>
-        <w:t>Phone_number</w:t>
-      </w:r>
-      <w:proofErr w:type="spellEnd"/>
-      <w:r>
-        <w:rPr>
-          <w:sz w:val="22"/>
-          <w:szCs w:val="22"/>
-        </w:rPr>
-        <w:t xml:space="preserve"> </w:t>
+      <w:r>
+        <w:rPr>
+          <w:sz w:val="22"/>
+          <w:szCs w:val="22"/>
+        </w:rPr>
+        <w:t xml:space="preserve">Phone_number </w:t>
       </w:r>
       <w:r>
         <w:rPr>
@@ -9411,21 +9199,12 @@
           <w:szCs w:val="22"/>
         </w:rPr>
       </w:pPr>
-      <w:proofErr w:type="spellStart"/>
-      <w:r>
-        <w:rPr>
-          <w:sz w:val="22"/>
-          <w:szCs w:val="22"/>
-        </w:rPr>
-        <w:t>Address_type</w:t>
-      </w:r>
-      <w:proofErr w:type="spellEnd"/>
-      <w:r>
-        <w:rPr>
-          <w:sz w:val="22"/>
-          <w:szCs w:val="22"/>
-        </w:rPr>
-        <w:t xml:space="preserve"> </w:t>
+      <w:r>
+        <w:rPr>
+          <w:sz w:val="22"/>
+          <w:szCs w:val="22"/>
+        </w:rPr>
+        <w:t xml:space="preserve">Address_type </w:t>
       </w:r>
       <w:r>
         <w:rPr>
@@ -9467,21 +9246,12 @@
           <w:szCs w:val="22"/>
         </w:rPr>
       </w:pPr>
-      <w:proofErr w:type="spellStart"/>
-      <w:r>
-        <w:rPr>
-          <w:sz w:val="22"/>
-          <w:szCs w:val="22"/>
-        </w:rPr>
-        <w:t>Payment_method</w:t>
-      </w:r>
-      <w:proofErr w:type="spellEnd"/>
-      <w:r>
-        <w:rPr>
-          <w:sz w:val="22"/>
-          <w:szCs w:val="22"/>
-        </w:rPr>
-        <w:t xml:space="preserve"> </w:t>
+      <w:r>
+        <w:rPr>
+          <w:sz w:val="22"/>
+          <w:szCs w:val="22"/>
+        </w:rPr>
+        <w:t xml:space="preserve">Payment_method </w:t>
       </w:r>
       <w:r>
         <w:rPr>
@@ -9538,21 +9308,12 @@
           <w:szCs w:val="22"/>
         </w:rPr>
       </w:pPr>
-      <w:proofErr w:type="spellStart"/>
-      <w:r>
-        <w:rPr>
-          <w:sz w:val="22"/>
-          <w:szCs w:val="22"/>
-        </w:rPr>
-        <w:t>Ordered_date</w:t>
-      </w:r>
-      <w:proofErr w:type="spellEnd"/>
-      <w:r>
-        <w:rPr>
-          <w:sz w:val="22"/>
-          <w:szCs w:val="22"/>
-        </w:rPr>
-        <w:t xml:space="preserve"> DATE </w:t>
+      <w:r>
+        <w:rPr>
+          <w:sz w:val="22"/>
+          <w:szCs w:val="22"/>
+        </w:rPr>
+        <w:t xml:space="preserve">Ordered_date DATE </w:t>
       </w:r>
       <w:r>
         <w:rPr>
@@ -9579,21 +9340,12 @@
           <w:szCs w:val="22"/>
         </w:rPr>
       </w:pPr>
-      <w:proofErr w:type="spellStart"/>
-      <w:r>
-        <w:rPr>
-          <w:sz w:val="22"/>
-          <w:szCs w:val="22"/>
-        </w:rPr>
-        <w:t>Ordered_time</w:t>
-      </w:r>
-      <w:proofErr w:type="spellEnd"/>
-      <w:r>
-        <w:rPr>
-          <w:sz w:val="22"/>
-          <w:szCs w:val="22"/>
-        </w:rPr>
-        <w:t xml:space="preserve"> TIME </w:t>
+      <w:r>
+        <w:rPr>
+          <w:sz w:val="22"/>
+          <w:szCs w:val="22"/>
+        </w:rPr>
+        <w:t xml:space="preserve">Ordered_time TIME </w:t>
       </w:r>
       <w:r>
         <w:rPr>
@@ -9620,21 +9372,12 @@
           <w:szCs w:val="22"/>
         </w:rPr>
       </w:pPr>
-      <w:proofErr w:type="spellStart"/>
-      <w:r>
-        <w:rPr>
-          <w:sz w:val="22"/>
-          <w:szCs w:val="22"/>
-        </w:rPr>
-        <w:t>Payment_status</w:t>
-      </w:r>
-      <w:proofErr w:type="spellEnd"/>
-      <w:r>
-        <w:rPr>
-          <w:sz w:val="22"/>
-          <w:szCs w:val="22"/>
-        </w:rPr>
-        <w:t xml:space="preserve"> </w:t>
+      <w:r>
+        <w:rPr>
+          <w:sz w:val="22"/>
+          <w:szCs w:val="22"/>
+        </w:rPr>
+        <w:t xml:space="preserve">Payment_status </w:t>
       </w:r>
       <w:r>
         <w:rPr>
@@ -9753,21 +9496,12 @@
           <w:szCs w:val="22"/>
         </w:rPr>
       </w:pPr>
-      <w:proofErr w:type="spellStart"/>
-      <w:r>
-        <w:rPr>
-          <w:sz w:val="22"/>
-          <w:szCs w:val="22"/>
-        </w:rPr>
-        <w:t>Cart_id</w:t>
-      </w:r>
-      <w:proofErr w:type="spellEnd"/>
-      <w:r>
-        <w:rPr>
-          <w:sz w:val="22"/>
-          <w:szCs w:val="22"/>
-        </w:rPr>
-        <w:t xml:space="preserve"> </w:t>
+      <w:r>
+        <w:rPr>
+          <w:sz w:val="22"/>
+          <w:szCs w:val="22"/>
+        </w:rPr>
+        <w:t xml:space="preserve">Cart_id </w:t>
       </w:r>
       <w:r>
         <w:rPr>
@@ -9847,23 +9581,7 @@
           <w:sz w:val="22"/>
           <w:szCs w:val="22"/>
         </w:rPr>
-        <w:t>(</w:t>
-      </w:r>
-      <w:proofErr w:type="spellStart"/>
-      <w:r>
-        <w:rPr>
-          <w:sz w:val="22"/>
-          <w:szCs w:val="22"/>
-        </w:rPr>
-        <w:t>Cart_id</w:t>
-      </w:r>
-      <w:proofErr w:type="spellEnd"/>
-      <w:r>
-        <w:rPr>
-          <w:sz w:val="22"/>
-          <w:szCs w:val="22"/>
-        </w:rPr>
-        <w:t xml:space="preserve">) </w:t>
+        <w:t xml:space="preserve">(Cart_id) </w:t>
       </w:r>
       <w:r>
         <w:rPr>
@@ -10195,21 +9913,12 @@
           <w:szCs w:val="22"/>
         </w:rPr>
       </w:pPr>
-      <w:proofErr w:type="spellStart"/>
-      <w:r>
-        <w:rPr>
-          <w:sz w:val="22"/>
-          <w:szCs w:val="22"/>
-        </w:rPr>
-        <w:t>Order_id</w:t>
-      </w:r>
-      <w:proofErr w:type="spellEnd"/>
-      <w:r>
-        <w:rPr>
-          <w:sz w:val="22"/>
-          <w:szCs w:val="22"/>
-        </w:rPr>
-        <w:t xml:space="preserve"> </w:t>
+      <w:r>
+        <w:rPr>
+          <w:sz w:val="22"/>
+          <w:szCs w:val="22"/>
+        </w:rPr>
+        <w:t xml:space="preserve">Order_id </w:t>
       </w:r>
       <w:r>
         <w:rPr>
@@ -10251,21 +9960,12 @@
           <w:szCs w:val="22"/>
         </w:rPr>
       </w:pPr>
-      <w:proofErr w:type="spellStart"/>
-      <w:r>
-        <w:rPr>
-          <w:sz w:val="22"/>
-          <w:szCs w:val="22"/>
-        </w:rPr>
-        <w:t>Delivery_status</w:t>
-      </w:r>
-      <w:proofErr w:type="spellEnd"/>
-      <w:r>
-        <w:rPr>
-          <w:sz w:val="22"/>
-          <w:szCs w:val="22"/>
-        </w:rPr>
-        <w:t xml:space="preserve"> </w:t>
+      <w:r>
+        <w:rPr>
+          <w:sz w:val="22"/>
+          <w:szCs w:val="22"/>
+        </w:rPr>
+        <w:t xml:space="preserve">Delivery_status </w:t>
       </w:r>
       <w:r>
         <w:rPr>
@@ -10350,23 +10050,7 @@
           <w:sz w:val="22"/>
           <w:szCs w:val="22"/>
         </w:rPr>
-        <w:t>(</w:t>
-      </w:r>
-      <w:proofErr w:type="spellStart"/>
-      <w:r>
-        <w:rPr>
-          <w:sz w:val="22"/>
-          <w:szCs w:val="22"/>
-        </w:rPr>
-        <w:t>Order_id</w:t>
-      </w:r>
-      <w:proofErr w:type="spellEnd"/>
-      <w:r>
-        <w:rPr>
-          <w:sz w:val="22"/>
-          <w:szCs w:val="22"/>
-        </w:rPr>
-        <w:t xml:space="preserve">) </w:t>
+        <w:t xml:space="preserve">(Order_id) </w:t>
       </w:r>
       <w:r>
         <w:rPr>
@@ -10540,23 +10224,13 @@
           <w:szCs w:val="32"/>
         </w:rPr>
       </w:pPr>
-      <w:proofErr w:type="spellStart"/>
       <w:r>
         <w:rPr>
           <w:color w:val="000000"/>
           <w:sz w:val="32"/>
           <w:szCs w:val="32"/>
         </w:rPr>
-        <w:t>Address_type</w:t>
-      </w:r>
-      <w:proofErr w:type="spellEnd"/>
-      <w:r>
-        <w:rPr>
-          <w:color w:val="000000"/>
-          <w:sz w:val="32"/>
-          <w:szCs w:val="32"/>
-        </w:rPr>
-        <w:t xml:space="preserve"> of </w:t>
+        <w:t xml:space="preserve">Address_type of </w:t>
       </w:r>
       <w:r>
         <w:rPr>
@@ -10573,7 +10247,23 @@
           <w:sz w:val="32"/>
           <w:szCs w:val="32"/>
         </w:rPr>
-        <w:t xml:space="preserve">should be only </w:t>
+        <w:t xml:space="preserve">should be </w:t>
+      </w:r>
+      <w:r>
+        <w:rPr>
+          <w:color w:val="000000"/>
+          <w:sz w:val="32"/>
+          <w:szCs w:val="32"/>
+        </w:rPr>
+        <w:t>either</w:t>
+      </w:r>
+      <w:r>
+        <w:rPr>
+          <w:color w:val="000000"/>
+          <w:sz w:val="32"/>
+          <w:szCs w:val="32"/>
+        </w:rPr>
+        <w:t xml:space="preserve"> </w:t>
       </w:r>
       <w:r>
         <w:rPr>
@@ -10628,7 +10318,6 @@
           <w:szCs w:val="32"/>
         </w:rPr>
       </w:pPr>
-      <w:proofErr w:type="spellStart"/>
       <w:r>
         <w:rPr>
           <w:color w:val="000000"/>
@@ -10637,7 +10326,6 @@
         </w:rPr>
         <w:t>Payment_method</w:t>
       </w:r>
-      <w:proofErr w:type="spellEnd"/>
       <w:r>
         <w:rPr>
           <w:rFonts w:ascii="Trebuchet MS" w:eastAsia="Trebuchet MS" w:hAnsi="Trebuchet MS" w:cs="Trebuchet MS"/>
@@ -10670,7 +10358,23 @@
           <w:sz w:val="32"/>
           <w:szCs w:val="32"/>
         </w:rPr>
-        <w:t xml:space="preserve">should be only </w:t>
+        <w:t xml:space="preserve">should be </w:t>
+      </w:r>
+      <w:r>
+        <w:rPr>
+          <w:color w:val="000000"/>
+          <w:sz w:val="32"/>
+          <w:szCs w:val="32"/>
+        </w:rPr>
+        <w:t>either</w:t>
+      </w:r>
+      <w:r>
+        <w:rPr>
+          <w:color w:val="000000"/>
+          <w:sz w:val="32"/>
+          <w:szCs w:val="32"/>
+        </w:rPr>
+        <w:t xml:space="preserve"> </w:t>
       </w:r>
       <w:r>
         <w:rPr>
@@ -10718,14 +10422,7 @@
           <w:sz w:val="32"/>
           <w:szCs w:val="32"/>
         </w:rPr>
-        <w:t xml:space="preserve">ard  </w:t>
-      </w:r>
-      <w:r>
-        <w:rPr>
-          <w:sz w:val="32"/>
-          <w:szCs w:val="32"/>
-        </w:rPr>
-        <w:t xml:space="preserve">or </w:t>
+        <w:t>ard</w:t>
       </w:r>
       <w:r>
         <w:rPr>
@@ -10733,7 +10430,7 @@
           <w:sz w:val="32"/>
           <w:szCs w:val="32"/>
         </w:rPr>
-        <w:t>online.</w:t>
+        <w:t>.</w:t>
       </w:r>
     </w:p>
     <w:p>
@@ -10756,23 +10453,29 @@
           <w:szCs w:val="36"/>
         </w:rPr>
       </w:pPr>
-      <w:proofErr w:type="spellStart"/>
       <w:r>
         <w:rPr>
           <w:color w:val="000000"/>
           <w:sz w:val="32"/>
           <w:szCs w:val="32"/>
         </w:rPr>
-        <w:t>Message_type</w:t>
-      </w:r>
-      <w:proofErr w:type="spellEnd"/>
+        <w:t xml:space="preserve">Message_type of MESSAGE  should be </w:t>
+      </w:r>
       <w:r>
         <w:rPr>
           <w:color w:val="000000"/>
           <w:sz w:val="32"/>
           <w:szCs w:val="32"/>
         </w:rPr>
-        <w:t xml:space="preserve"> of MESSAGE  should be only </w:t>
+        <w:t>either</w:t>
+      </w:r>
+      <w:r>
+        <w:rPr>
+          <w:color w:val="000000"/>
+          <w:sz w:val="32"/>
+          <w:szCs w:val="32"/>
+        </w:rPr>
+        <w:t xml:space="preserve"> </w:t>
       </w:r>
       <w:r>
         <w:rPr>
@@ -11781,23 +11484,7 @@
           <w:szCs w:val="28"/>
         </w:rPr>
         <w:lastRenderedPageBreak/>
-        <w:t xml:space="preserve">For </w:t>
-      </w:r>
-      <w:proofErr w:type="spellStart"/>
-      <w:r>
-        <w:rPr>
-          <w:sz w:val="28"/>
-          <w:szCs w:val="28"/>
-        </w:rPr>
-        <w:t>cart_product</w:t>
-      </w:r>
-      <w:proofErr w:type="spellEnd"/>
-      <w:r>
-        <w:rPr>
-          <w:sz w:val="28"/>
-          <w:szCs w:val="28"/>
-        </w:rPr>
-        <w:t xml:space="preserve"> table</w:t>
+        <w:t>For cart_product table</w:t>
       </w:r>
     </w:p>
     <w:p>
@@ -12105,23 +11792,7 @@
           <w:szCs w:val="28"/>
         </w:rPr>
         <w:lastRenderedPageBreak/>
-        <w:t xml:space="preserve">For </w:t>
-      </w:r>
-      <w:proofErr w:type="spellStart"/>
-      <w:r>
-        <w:rPr>
-          <w:sz w:val="28"/>
-          <w:szCs w:val="28"/>
-        </w:rPr>
-        <w:t>wishlist_product</w:t>
-      </w:r>
-      <w:proofErr w:type="spellEnd"/>
-      <w:r>
-        <w:rPr>
-          <w:sz w:val="28"/>
-          <w:szCs w:val="28"/>
-        </w:rPr>
-        <w:t xml:space="preserve"> table</w:t>
+        <w:t>For wishlist_product table</w:t>
       </w:r>
     </w:p>
     <w:p>
@@ -12422,23 +12093,7 @@
           <w:szCs w:val="28"/>
         </w:rPr>
         <w:lastRenderedPageBreak/>
-        <w:t xml:space="preserve">For </w:t>
-      </w:r>
-      <w:proofErr w:type="spellStart"/>
-      <w:r>
-        <w:rPr>
-          <w:sz w:val="28"/>
-          <w:szCs w:val="28"/>
-        </w:rPr>
-        <w:t>order_table</w:t>
-      </w:r>
-      <w:proofErr w:type="spellEnd"/>
-      <w:r>
-        <w:rPr>
-          <w:sz w:val="28"/>
-          <w:szCs w:val="28"/>
-        </w:rPr>
-        <w:t xml:space="preserve"> table</w:t>
+        <w:t>For order_table table</w:t>
       </w:r>
     </w:p>
     <w:p>
@@ -13564,87 +13219,7 @@
           <w:szCs w:val="28"/>
         </w:rPr>
         <w:lastRenderedPageBreak/>
-        <w:t xml:space="preserve">• Select </w:t>
-      </w:r>
-      <w:proofErr w:type="spellStart"/>
-      <w:r>
-        <w:rPr>
-          <w:sz w:val="28"/>
-          <w:szCs w:val="28"/>
-        </w:rPr>
-        <w:t>Phone_number</w:t>
-      </w:r>
-      <w:proofErr w:type="spellEnd"/>
-      <w:r>
-        <w:rPr>
-          <w:sz w:val="28"/>
-          <w:szCs w:val="28"/>
-        </w:rPr>
-        <w:t xml:space="preserve"> , Address, </w:t>
-      </w:r>
-      <w:proofErr w:type="spellStart"/>
-      <w:r>
-        <w:rPr>
-          <w:sz w:val="28"/>
-          <w:szCs w:val="28"/>
-        </w:rPr>
-        <w:t>Ordered_date</w:t>
-      </w:r>
-      <w:proofErr w:type="spellEnd"/>
-      <w:r>
-        <w:rPr>
-          <w:sz w:val="28"/>
-          <w:szCs w:val="28"/>
-        </w:rPr>
-        <w:t xml:space="preserve">, </w:t>
-      </w:r>
-      <w:proofErr w:type="spellStart"/>
-      <w:r>
-        <w:rPr>
-          <w:sz w:val="28"/>
-          <w:szCs w:val="28"/>
-        </w:rPr>
-        <w:t>Ordered_time</w:t>
-      </w:r>
-      <w:proofErr w:type="spellEnd"/>
-      <w:r>
-        <w:rPr>
-          <w:sz w:val="28"/>
-          <w:szCs w:val="28"/>
-        </w:rPr>
-        <w:t xml:space="preserve">, </w:t>
-      </w:r>
-      <w:proofErr w:type="spellStart"/>
-      <w:r>
-        <w:rPr>
-          <w:sz w:val="28"/>
-          <w:szCs w:val="28"/>
-        </w:rPr>
-        <w:t>Delivery_status</w:t>
-      </w:r>
-      <w:proofErr w:type="spellEnd"/>
-      <w:r>
-        <w:rPr>
-          <w:sz w:val="28"/>
-          <w:szCs w:val="28"/>
-        </w:rPr>
-        <w:t xml:space="preserve">  from the </w:t>
-      </w:r>
-      <w:proofErr w:type="spellStart"/>
-      <w:r>
-        <w:rPr>
-          <w:sz w:val="28"/>
-          <w:szCs w:val="28"/>
-        </w:rPr>
-        <w:t>order_table</w:t>
-      </w:r>
-      <w:proofErr w:type="spellEnd"/>
-      <w:r>
-        <w:rPr>
-          <w:sz w:val="28"/>
-          <w:szCs w:val="28"/>
-        </w:rPr>
-        <w:t xml:space="preserve"> and delivery tables.</w:t>
+        <w:t>• Select Phone_number , Address, Ordered_date, Ordered_time, Delivery_status  from the order_table and delivery tables.</w:t>
       </w:r>
     </w:p>
     <w:p>
@@ -13854,17 +13429,8 @@
           <w:sz w:val="28"/>
           <w:szCs w:val="28"/>
         </w:rPr>
-        <w:t xml:space="preserve">1. D. L. A. </w:t>
-      </w:r>
-      <w:proofErr w:type="spellStart"/>
-      <w:r>
-        <w:rPr>
-          <w:sz w:val="28"/>
-          <w:szCs w:val="28"/>
-        </w:rPr>
-        <w:t>Thathsarani</w:t>
-      </w:r>
-      <w:proofErr w:type="spellEnd"/>
+        <w:t>1. D. L. A. Thathsarani</w:t>
+      </w:r>
     </w:p>
     <w:p>
       <w:pPr>
@@ -13960,17 +13526,8 @@
           <w:sz w:val="28"/>
           <w:szCs w:val="28"/>
         </w:rPr>
-        <w:t xml:space="preserve">2. N .D. K. N. </w:t>
-      </w:r>
-      <w:proofErr w:type="spellStart"/>
-      <w:r>
-        <w:rPr>
-          <w:sz w:val="28"/>
-          <w:szCs w:val="28"/>
-        </w:rPr>
-        <w:t>Sooriyasena</w:t>
-      </w:r>
-      <w:proofErr w:type="spellEnd"/>
+        <w:t>2. N .D. K. N. Sooriyasena</w:t>
+      </w:r>
     </w:p>
     <w:p>
       <w:pPr>
@@ -14283,7 +13840,21 @@
           <w:sz w:val="28"/>
           <w:szCs w:val="28"/>
         </w:rPr>
-        <w:t xml:space="preserve">Add product details and contact us pages. </w:t>
+        <w:t>Add</w:t>
+      </w:r>
+      <w:r>
+        <w:rPr>
+          <w:sz w:val="28"/>
+          <w:szCs w:val="28"/>
+        </w:rPr>
+        <w:t>ed</w:t>
+      </w:r>
+      <w:r>
+        <w:rPr>
+          <w:sz w:val="28"/>
+          <w:szCs w:val="28"/>
+        </w:rPr>
+        <w:t xml:space="preserve"> product details and contact us pages. </w:t>
       </w:r>
     </w:p>
     <w:p>
@@ -14303,7 +13874,35 @@
           <w:sz w:val="28"/>
           <w:szCs w:val="28"/>
         </w:rPr>
-        <w:t>Planning and  Designing the  ER Diagram  and  relational schema for  Database.</w:t>
+        <w:t>Plann</w:t>
+      </w:r>
+      <w:r>
+        <w:rPr>
+          <w:sz w:val="28"/>
+          <w:szCs w:val="28"/>
+        </w:rPr>
+        <w:t>ed</w:t>
+      </w:r>
+      <w:r>
+        <w:rPr>
+          <w:sz w:val="28"/>
+          <w:szCs w:val="28"/>
+        </w:rPr>
+        <w:t xml:space="preserve"> and  Design</w:t>
+      </w:r>
+      <w:r>
+        <w:rPr>
+          <w:sz w:val="28"/>
+          <w:szCs w:val="28"/>
+        </w:rPr>
+        <w:t>ed</w:t>
+      </w:r>
+      <w:r>
+        <w:rPr>
+          <w:sz w:val="28"/>
+          <w:szCs w:val="28"/>
+        </w:rPr>
+        <w:t xml:space="preserve"> the  ER Diagram  and  relational schema for  Database.</w:t>
       </w:r>
     </w:p>
     <w:p>
@@ -14323,7 +13922,21 @@
           <w:sz w:val="28"/>
           <w:szCs w:val="28"/>
         </w:rPr>
-        <w:t>Planning the database format   and  designing</w:t>
+        <w:t>Plann</w:t>
+      </w:r>
+      <w:r>
+        <w:rPr>
+          <w:sz w:val="28"/>
+          <w:szCs w:val="28"/>
+        </w:rPr>
+        <w:t>ed</w:t>
+      </w:r>
+      <w:r>
+        <w:rPr>
+          <w:sz w:val="28"/>
+          <w:szCs w:val="28"/>
+        </w:rPr>
+        <w:t xml:space="preserve"> the database format   and  designing</w:t>
       </w:r>
       <w:r>
         <w:rPr>
@@ -14359,7 +13972,21 @@
           <w:sz w:val="28"/>
           <w:szCs w:val="28"/>
         </w:rPr>
-        <w:t>Create  Database details &amp; ER Diagram pages for  Project report.</w:t>
+        <w:t>Create</w:t>
+      </w:r>
+      <w:r>
+        <w:rPr>
+          <w:sz w:val="28"/>
+          <w:szCs w:val="28"/>
+        </w:rPr>
+        <w:t>d</w:t>
+      </w:r>
+      <w:r>
+        <w:rPr>
+          <w:sz w:val="28"/>
+          <w:szCs w:val="28"/>
+        </w:rPr>
+        <w:t xml:space="preserve">  Database details &amp; ER Diagram pages for  Project report.</w:t>
       </w:r>
     </w:p>
     <w:p>
@@ -14813,7 +14440,13 @@
       <w:rPr>
         <w:color w:val="00B050"/>
       </w:rPr>
-      <w:t xml:space="preserve"> CSC 209 2.0 DBMS</w:t>
+      <w:t xml:space="preserve"> </w:t>
+    </w:r>
+    <w:r>
+      <w:rPr>
+        <w:color w:val="FF00FF"/>
+      </w:rPr>
+      <w:t>CSC 209 2.0 DBMS</w:t>
     </w:r>
   </w:p>
   <w:p>

</xml_diff>